<commit_message>
Belge arşivi: öğretmenler kurulu tutanakları sürüm 2026.08.1
Sene başı tutanağına (GNL-OKR-OKT-001) ders programı ve nöbet görevi
tercih/mazeret bildirim formu çerçevesi eklendi: gündem 12 görüşmesinde
süt izni (OKY md. 12/2-a) ve formun tanıtımı, planlama esasları (a-f,
sayılar yer tutuculu), KARAR 11'de esasların kabulü ve formla yazılı
bildirim; gündem 13'te forma atıf; dayanaklar çizelgesi güncellendi.

Kaynak: evrakmotoru fe0960d (SAL-NBT-FR-001). KVKK ve biçim denetimi
temiz; eski 2026.08 ZIP kaldırıldı, paket ve manifest yenilendi.

Co-Authored-By: Claude Fable 5 <noreply@anthropic.com>
</commit_message>
<xml_diff>
--- a/public/evrak/ogretmenler-kurulu-tutanaklari/GNL-OKR-OKT-001_Sene_Basi_Ogretmenler_Kurulu_Cerceve_Tutanagi_2026-2027_v1.0.docx
+++ b/public/evrak/ogretmenler-kurulu-tutanaklari/GNL-OKR-OKT-001_Sene_Basi_Ogretmenler_Kurulu_Cerceve_Tutanagi_2026-2027_v1.0.docx
@@ -250,7 +250,7 @@
                 <w:i w:val="0"/>
                 <w:sz w:val="18"/>
               </w:rPr>
-              <w:t>• Bu belge, okulapp.org üzerinde yayımlanan GENEL TUTANAK ŞABLONU setinin parçasıdır (sürüm: 2026.08 (28.08.2026)). Resmî bir Bakanlık belgesi değildir; okulun şartlarına ve toplantıda gerçekten görüşülen hususlara göre uyarlanır. Metindeki mevzuat atıfları 28.08.2026 tarihi itibarıyla yürürlükteki hükümlere göre yazılmıştır; kullanmadan önce güncelliği kontrol ediniz. Lisans: CC BY 4.0 — kaynak gösterilerek kullanılabilir ve uyarlanabilir.</w:t>
+              <w:t>• Bu belge, okulapp.org üzerinde yayımlanan GENEL TUTANAK ŞABLONU setinin parçasıdır (sürüm: 2026.08.1 (29.08.2026)). Resmî bir Bakanlık belgesi değildir; okulun şartlarına ve toplantıda gerçekten görüşülen hususlara göre uyarlanır. Metindeki mevzuat atıfları 28.08.2026 tarihi itibarıyla yürürlükteki hükümlere göre yazılmıştır; kullanmadan önce güncelliği kontrol ediniz. Lisans: CC BY 4.0 — kaynak gösterilerek kullanılabilir ve uyarlanabilir.</w:t>
             </w:r>
           </w:p>
           <w:p>
@@ -12360,7 +12360,7 @@
           <w:i w:val="0"/>
           <w:sz w:val="20"/>
         </w:rPr>
-        <w:t>Okul müdürü, haftalık ders programının belirlenmesinde üç ölçütün birlikte gözetildiğini ifade etti: mevzuat hükümleri, derslerin niteliğinden ve öğrencinin günlük dikkat düzeninden doğan pedagojik gerekler ile derslik ve laboratuvar kapasitesi, spor salonu kullanımı gibi okula özgü durumlar. Bu çerçevede beden eğitimi ve müzik derslerinin haftanın ilk ve son iş gününe konulmasına özen gösterileceği; blok ders uygulamalarında dersin özelliğinin dikkate alınacağı; Ortaöğretim Kurumları Yönetmeliği gereğince engelli öğretmenlerin, bakmakla yükümlü olduğu engelli yakını bulunanların ve otuz altı ayını doldurmamış çocuğu olan öğretmenlerin tercihlerinin öncelikle gözetileceği belirtildi.</w:t>
+        <w:t>Okul müdürü, haftalık ders programının belirlenmesinde üç ölçütün birlikte gözetildiğini ifade etti: mevzuat hükümleri, derslerin niteliğinden ve öğrencinin günlük dikkat düzeninden doğan pedagojik gerekler ile derslik ve laboratuvar kapasitesi, spor salonu kullanımı gibi okula özgü durumlar. Bu çerçevede beden eğitimi ve müzik derslerinin haftanın ilk ve son iş gününe konulmasına özen gösterileceği; blok ders uygulamalarında dersin özelliğinin dikkate alınacağı; Ortaöğretim Kurumları Yönetmeliği gereğince engelli öğretmenlerin, bakmakla yükümlü olduğu engelli yakını bulunanların ve otuz altı ayını doldurmamış çocuğu olan öğretmenlerin tercihlerinin öncelikle gözetileceği; süt izni kullanan öğretmenlerin programlarının süt iznini kullanmalarına imkân verecek şekilde düzenleneceği belirtildi.</w:t>
       </w:r>
     </w:p>
     <w:p>
@@ -12374,7 +12374,72 @@
           <w:i w:val="0"/>
           <w:sz w:val="20"/>
         </w:rPr>
-        <w:t>Bunların yanında öğretmenlerden toplanan program taleplerinin de imkânlar ölçüsünde değerlendirileceği vurgulandı. Okul müdürlüğünün bu konudaki yaklaşımının, hazırlanan programı olduğu gibi uygulatmak değil; mevzuata ve pedagojik gereklere aykırı düşmeyen, okulun imkânlarıyla bağdaşan talepleri karşılamaya çalışmak olduğu ifade edildi. Ders programı hazırlanırken benimsenen amacın, öğretmen ve öğrenci memnuniyetini artırarak eğitimde kaliteyi yükseltmek olduğu; memnuniyeti yüksek bir öğretmenin derse yansıyan veriminin doğrudan öğrencinin öğrenmesine katkı sağladığı belirtildi. Talebi bulunan öğretmenlerin isteklerini gerekçesiyle birlikte ilgili müdür yardımcısına iletebilecekleri; karşılanamayan taleplerde gerekçenin ilgiliye açıklanacağı kayda geçirildi.</w:t>
+        <w:t>Bunların yanında öğretmenlerden toplanan program taleplerinin de imkânlar ölçüsünde değerlendirileceği vurgulandı. Okul müdürlüğünün bu konudaki yaklaşımının, hazırlanan programı olduğu gibi uygulatmak değil; mevzuata ve pedagojik gereklere aykırı düşmeyen, okulun imkânlarıyla bağdaşan talepleri karşılamaya çalışmak olduğu ifade edildi. Ders programı hazırlanırken benimsenen amacın, öğretmen ve öğrenci memnuniyetini artırarak eğitimde kaliteyi yükseltmek olduğu; memnuniyeti yüksek bir öğretmenin derse yansıyan veriminin doğrudan öğrencinin öğrenmesine katkı sağladığı belirtildi. Tercih ve mazeret bildirimlerinin, bu amaçla hazırlanan Ders Programı ve Nöbet Görevi Tercih ve Mazeret Bildirim Formu ile yazılı olarak toplanacağı; formda haftalık ders programına ilişkin mazeret ve tercihler ile nöbet görevine ilişkin muafiyet ve gün tercihlerinin ve ders alınmak istenmeyen saatler çizelgesinin yer aldığı; karşılanamayan taleplerde gerekçenin ilgiliye açıklanacağı kayda geçirildi.</w:t>
+      </w:r>
+    </w:p>
+    <w:p>
+      <w:pPr>
+        <w:spacing w:after="80" w:before="0"/>
+        <w:jc w:val="both"/>
+      </w:pPr>
+      <w:r>
+        <w:rPr>
+          <w:b w:val="0"/>
+          <w:i w:val="0"/>
+          <w:sz w:val="20"/>
+        </w:rPr>
+        <w:t xml:space="preserve">Formla birlikte uygulanacak planlama esasları kurula açıklandı: (a) formdaki saat çizelgesinde işaretlenebilecek saat sayısı en fazla </w:t>
+      </w:r>
+      <w:r>
+        <w:rPr>
+          <w:b w:val="0"/>
+          <w:i w:val="0"/>
+          <w:color w:val="C00000"/>
+          <w:sz w:val="20"/>
+        </w:rPr>
+        <w:t>[……………………]</w:t>
+      </w:r>
+      <w:r>
+        <w:rPr>
+          <w:b w:val="0"/>
+          <w:i w:val="0"/>
+          <w:sz w:val="20"/>
+        </w:rPr>
+        <w:t xml:space="preserve"> saattir; mazeretini belgelendiren öğretmenlerde bu sınır </w:t>
+      </w:r>
+      <w:r>
+        <w:rPr>
+          <w:b w:val="0"/>
+          <w:i w:val="0"/>
+          <w:color w:val="C00000"/>
+          <w:sz w:val="20"/>
+        </w:rPr>
+        <w:t>[……………………]</w:t>
+      </w:r>
+      <w:r>
+        <w:rPr>
+          <w:b w:val="0"/>
+          <w:i w:val="0"/>
+          <w:sz w:val="20"/>
+        </w:rPr>
+        <w:t xml:space="preserve"> saate yükselir, üst sınırı aşan işaretlemeler değerlendirmeye alınmaz; (b) boş gün talep eden öğretmenler için haftalık boş ders (ders aralarındaki boşluk) sınırı gün seçimine göre </w:t>
+      </w:r>
+      <w:r>
+        <w:rPr>
+          <w:b w:val="0"/>
+          <w:i w:val="0"/>
+          <w:color w:val="C00000"/>
+          <w:sz w:val="20"/>
+        </w:rPr>
+        <w:t>[……………………]</w:t>
+      </w:r>
+      <w:r>
+        <w:rPr>
+          <w:b w:val="0"/>
+          <w:i w:val="0"/>
+          <w:sz w:val="20"/>
+        </w:rPr>
+        <w:t xml:space="preserve"> saattir; (c) nöbet gününde tam gün okulda bulunulduğundan nöbet günündeki boşluklar haftalık boş ders sayımına dâhil edilmez; (ç) nöbet görevi, günlük ders sayısının beş saati aştığı günlere verilmez — bu uygulama, nöbetin dersin en az bulunduğu günde verilmesine ilişkin Yönetmelik hükmüyle uyumludur; (d) nöbetçi müdür yardımcısı nöbet günü boyunca okulun genel işleyişini ve giriş-çıkışları yönettiğinden müdür yardımcılarına nöbet günlerinde ders verilmez, ders görevleri haftanın diğer günlerine yerleştirilir; (e) okulun haftalık toplam ders yükü sabit olduğundan aynı gün ve saatlerde yoğunlaşan kapatma talepleri ile laboratuvar, bilişim teknolojileri sınıfı ve spor salonu gibi derslik bağımlı derslerdeki çakışan talepler, branş bazındaki ders dağılımı ve hakkaniyet gözetilerek ancak kısmen karşılanabilir; (f) formdaki işaretlemeler tercih bildirimi niteliğindedir ve program okulun genel işleyişini bozmayacak şekilde imkânlar ölçüsünde düzenlenir.</w:t>
       </w:r>
     </w:p>
     <w:p>
@@ -12397,7 +12462,7 @@
           <w:i w:val="0"/>
           <w:sz w:val="20"/>
         </w:rPr>
-        <w:t xml:space="preserve">Haftalık ders programının; mevzuat hükümleri, pedagojik gerekler ve okula özgü durumlar gözetilerek, öğretmenlerden alınan talepler de imkânlar ölçüsünde değerlendirilmek suretiyle hazırlanmasına; </w:t>
+        <w:t xml:space="preserve">Haftalık ders programının; mevzuat hükümleri, pedagojik gerekler ve okula özgü durumlar gözetilerek, öğretmenlerden alınan talepler de imkânlar ölçüsünde değerlendirilmek suretiyle hazırlanmasına; görüşülen program ve nöbet planlama esaslarının kabulüne; ders programı ve nöbet görevine ilişkin tercih ve mazeret bildirimlerinin, Ders Programı ve Nöbet Görevi Tercih ve Mazeret Bildirim Formu doldurulup dayanak belgeler eklenerek </w:t>
       </w:r>
       <w:r>
         <w:rPr>
@@ -12406,6 +12471,23 @@
           <w:color w:val="C00000"/>
           <w:sz w:val="20"/>
         </w:rPr>
+        <w:t>[……………………]</w:t>
+      </w:r>
+      <w:r>
+        <w:rPr>
+          <w:b w:val="0"/>
+          <w:i w:val="0"/>
+          <w:sz w:val="20"/>
+        </w:rPr>
+        <w:t xml:space="preserve">/09/2026 tarihine kadar ilgili müdür yardımcısına yazılı olarak yapılmasına; programın </w:t>
+      </w:r>
+      <w:r>
+        <w:rPr>
+          <w:b w:val="0"/>
+          <w:i w:val="0"/>
+          <w:color w:val="C00000"/>
+          <w:sz w:val="20"/>
+        </w:rPr>
         <w:t>[görüş ve önerilerle]</w:t>
       </w:r>
       <w:r>
@@ -12414,7 +12496,7 @@
           <w:i w:val="0"/>
           <w:sz w:val="20"/>
         </w:rPr>
-        <w:t xml:space="preserve"> birlikte okul müdürünün onayına bağlı olarak uygulanmasına ve ilgililere imza karşılığı duyurulmasına karar verilmiştir. Programa ilişkin talepler gerekçesiyle birlikte ilgili müdür yardımcısına iletilecek; karşılanamayan taleplerin gerekçesi ilgilisine açıklanacaktır.</w:t>
+        <w:t xml:space="preserve"> birlikte okul müdürünün onayına bağlı olarak uygulanmasına ve ilgililere imza karşılığı duyurulmasına karar verilmiştir. Karşılanamayan taleplerin gerekçesi ilgilisine açıklanacaktır.</w:t>
       </w:r>
     </w:p>
     <w:p>
@@ -12444,7 +12526,7 @@
           <w:i w:val="0"/>
           <w:sz w:val="20"/>
         </w:rPr>
-        <w:t>Nöbetlerde uyulacak esasların öğretmenler kurulunda görüşülüp kararlaştırılacağı ve müdür onayından sonra öğretmenlere yazılı olarak duyurulacağı belirtildi. Ortaöğretim Kurumları Yönetmeliğinin 91 inci maddesi uyarınca nöbet görevinin ilk dersten otuz dakika önce başlayıp son ders bitiminden otuz dakika sonra sona ereceği, okulun özelliğine göre bu sürenin kurul kararıyla on beş dakikadan az olmamak üzere kısaltılabileceği hatırlatıldı. Hamilelik, hizmet yılı ve engellilik durumlarına ilişkin muafiyet hükümleri ile rehber öğretmenlere nöbet görevi verilemeyeceği kayda geçirildi.</w:t>
+        <w:t>Nöbetlerde uyulacak esasların öğretmenler kurulunda görüşülüp kararlaştırılacağı ve müdür onayından sonra öğretmenlere yazılı olarak duyurulacağı belirtildi. Ortaöğretim Kurumları Yönetmeliğinin 91 inci maddesi uyarınca nöbet görevinin ilk dersten otuz dakika önce başlayıp son ders bitiminden otuz dakika sonra sona ereceği, okulun özelliğine göre bu sürenin kurul kararıyla on beş dakikadan az olmamak üzere kısaltılabileceği hatırlatıldı. Hamilelik, hizmet yılı ve engellilik durumlarına ilişkin muafiyet hükümleri ile rehber öğretmenlere nöbet görevi verilemeyeceği kayda geçirildi. Nöbet muafiyet taleplerinin, mazeretlerin ve nöbet günü tercihlerinin, haftalık ders programı tercihleriyle birlikte gündemin on ikinci maddesinde görüşülen Ders Programı ve Nöbet Görevi Tercih ve Mazeret Bildirim Formu ile yazılı olarak bildirileceği belirtildi.</w:t>
       </w:r>
     </w:p>
     <w:p>
@@ -16855,7 +16937,7 @@
           <w:i w:val="0"/>
           <w:sz w:val="20"/>
         </w:rPr>
-        <w:t xml:space="preserve">Haftalık ders programının; mevzuat hükümleri, pedagojik gerekler ve okula özgü durumlar gözetilerek, öğretmenlerden alınan talepler de imkânlar ölçüsünde değerlendirilmek suretiyle hazırlanmasına; </w:t>
+        <w:t xml:space="preserve">Haftalık ders programının; mevzuat hükümleri, pedagojik gerekler ve okula özgü durumlar gözetilerek, öğretmenlerden alınan talepler de imkânlar ölçüsünde değerlendirilmek suretiyle hazırlanmasına; görüşülen program ve nöbet planlama esaslarının kabulüne; ders programı ve nöbet görevine ilişkin tercih ve mazeret bildirimlerinin, Ders Programı ve Nöbet Görevi Tercih ve Mazeret Bildirim Formu doldurulup dayanak belgeler eklenerek </w:t>
       </w:r>
       <w:r>
         <w:rPr>
@@ -16864,6 +16946,23 @@
           <w:color w:val="C00000"/>
           <w:sz w:val="20"/>
         </w:rPr>
+        <w:t>[……………………]</w:t>
+      </w:r>
+      <w:r>
+        <w:rPr>
+          <w:b w:val="0"/>
+          <w:i w:val="0"/>
+          <w:sz w:val="20"/>
+        </w:rPr>
+        <w:t xml:space="preserve">/09/2026 tarihine kadar ilgili müdür yardımcısına yazılı olarak yapılmasına; programın </w:t>
+      </w:r>
+      <w:r>
+        <w:rPr>
+          <w:b w:val="0"/>
+          <w:i w:val="0"/>
+          <w:color w:val="C00000"/>
+          <w:sz w:val="20"/>
+        </w:rPr>
         <w:t>[görüş ve önerilerle]</w:t>
       </w:r>
       <w:r>
@@ -16872,7 +16971,7 @@
           <w:i w:val="0"/>
           <w:sz w:val="20"/>
         </w:rPr>
-        <w:t xml:space="preserve"> birlikte okul müdürünün onayına bağlı olarak uygulanmasına ve ilgililere imza karşılığı duyurulmasına karar verilmiştir. Programa ilişkin talepler gerekçesiyle birlikte ilgili müdür yardımcısına iletilecek; karşılanamayan taleplerin gerekçesi ilgilisine açıklanacaktır.</w:t>
+        <w:t xml:space="preserve"> birlikte okul müdürünün onayına bağlı olarak uygulanmasına ve ilgililere imza karşılığı duyurulmasına karar verilmiştir. Karşılanamayan taleplerin gerekçesi ilgilisine açıklanacaktır.</w:t>
       </w:r>
     </w:p>
     <w:p>
@@ -18600,7 +18699,7 @@
                 <w:i w:val="0"/>
                 <w:sz w:val="18"/>
               </w:rPr>
-              <w:t>Okulun nöbetçi öğretmen, nöbetçi öğrenci ve nöbetçi müdür yardımcısı talimatnameleri (okul içi düzenleme)</w:t>
+              <w:t>Okulun nöbetçi öğretmen, nöbetçi öğrenci ve nöbetçi müdür yardımcısı talimatnameleri ile ders programı ve nöbet görevi tercih ve mazeret bildirim formu (okul içi düzenleme)</w:t>
             </w:r>
           </w:p>
         </w:tc>
@@ -18616,7 +18715,7 @@
                 <w:i w:val="0"/>
                 <w:sz w:val="18"/>
               </w:rPr>
-              <w:t>13, 14</w:t>
+              <w:t>12, 13, 14</w:t>
             </w:r>
           </w:p>
         </w:tc>

</xml_diff>

<commit_message>
Belge arşivi: öğretmenler kurulu tutanakları sürüm 2026.08.2
Sene başı tutanağında (GNL-OKR-OKT-001) gündem 12 kurgusu düzeltildi:
kurulda hazır bir program sunulmaz; programın hazırlanmasında uygulanacak
ilkeler kararlaştırılır, program ilkelere ve toplanacak tercih-mazeret
bildirimlerine göre sonra hazırlanır (OKY md. 12/1). Görüşmeye öğrenci
menfaatini esas alan pedagojik hazırlama ilkeleri (a-d: sayısal/sözel
denge, dersin haftaya yayılması, soyut dersler ilk / uygulamalı dersler
son saatler, hareketli ders sonrası yoğun ders konmaması, boşluksuz şube
programı) eklendi; KARAR 11 hizalandı.

Kaynak: evrakmotoru 2c37e7f. KVKK ve biçim denetimi temiz; 2026.08.1 ZIP
kaldırıldı, paket ve manifest yenilendi.

Co-Authored-By: Claude Fable 5 <noreply@anthropic.com>
</commit_message>
<xml_diff>
--- a/public/evrak/ogretmenler-kurulu-tutanaklari/GNL-OKR-OKT-001_Sene_Basi_Ogretmenler_Kurulu_Cerceve_Tutanagi_2026-2027_v1.0.docx
+++ b/public/evrak/ogretmenler-kurulu-tutanaklari/GNL-OKR-OKT-001_Sene_Basi_Ogretmenler_Kurulu_Cerceve_Tutanagi_2026-2027_v1.0.docx
@@ -250,7 +250,7 @@
                 <w:i w:val="0"/>
                 <w:sz w:val="18"/>
               </w:rPr>
-              <w:t>• Bu belge, okulapp.org üzerinde yayımlanan GENEL TUTANAK ŞABLONU setinin parçasıdır (sürüm: 2026.08.1 (29.08.2026)). Resmî bir Bakanlık belgesi değildir; okulun şartlarına ve toplantıda gerçekten görüşülen hususlara göre uyarlanır. Metindeki mevzuat atıfları 28.08.2026 tarihi itibarıyla yürürlükteki hükümlere göre yazılmıştır; kullanmadan önce güncelliği kontrol ediniz. Lisans: CC BY 4.0 — kaynak gösterilerek kullanılabilir ve uyarlanabilir.</w:t>
+              <w:t>• Bu belge, okulapp.org üzerinde yayımlanan GENEL TUTANAK ŞABLONU setinin parçasıdır (sürüm: 2026.08.2 (29.08.2026)). Resmî bir Bakanlık belgesi değildir; okulun şartlarına ve toplantıda gerçekten görüşülen hususlara göre uyarlanır. Metindeki mevzuat atıfları 28.08.2026 tarihi itibarıyla yürürlükteki hükümlere göre yazılmıştır; kullanmadan önce güncelliği kontrol ediniz. Lisans: CC BY 4.0 — kaynak gösterilerek kullanılabilir ve uyarlanabilir.</w:t>
             </w:r>
           </w:p>
           <w:p>
@@ -12346,7 +12346,7 @@
           <w:i w:val="0"/>
           <w:sz w:val="20"/>
         </w:rPr>
-        <w:t>Haftalık ders programı taslağı kurulun görüşüne sunuldu. Programın okulun günlük zaman çizelgesine göre hazırlandığı; ders dağılımında öğretmenlerin programlarında gereksiz boşluk kalmamasına ve derslerin güne dengeli yayılmasına dikkat edildiği belirtildi.</w:t>
+        <w:t>Haftalık ders programının hazırlık süreci görüşüldü. Ortaöğretim Kurumları Yönetmeliğinin 12 nci maddesi uyarınca programın öğretmenler kurulunda görüşülüp okul müdürünün onayına bağlı olarak uygulamaya konulacağı hatırlatıldı; toplantı tarihinde henüz hazırlanmış bir program bulunmadığından bu maddede programın kendisinin değil, program hazırlanırken uygulanacak ilkelerin görüşülüp kararlaştırıldığı, programın bu ilkelere ve toplanacak tercih-mazeret bildirimlerine göre hazırlanarak ders yılı başından önce ilgililere imza karşılığı duyurulacağı ifade edildi. Programın okulun günlük zaman çizelgesine göre hazırlanacağı; ders dağılımında öğretmenlerin programlarında gereksiz boşluk kalmamasına ve derslerin güne dengeli yayılmasına dikkat edileceği belirtildi.</w:t>
       </w:r>
     </w:p>
     <w:p>
@@ -12360,7 +12360,7 @@
           <w:i w:val="0"/>
           <w:sz w:val="20"/>
         </w:rPr>
-        <w:t>Okul müdürü, haftalık ders programının belirlenmesinde üç ölçütün birlikte gözetildiğini ifade etti: mevzuat hükümleri, derslerin niteliğinden ve öğrencinin günlük dikkat düzeninden doğan pedagojik gerekler ile derslik ve laboratuvar kapasitesi, spor salonu kullanımı gibi okula özgü durumlar. Bu çerçevede beden eğitimi ve müzik derslerinin haftanın ilk ve son iş gününe konulmasına özen gösterileceği; blok ders uygulamalarında dersin özelliğinin dikkate alınacağı; Ortaöğretim Kurumları Yönetmeliği gereğince engelli öğretmenlerin, bakmakla yükümlü olduğu engelli yakını bulunanların ve otuz altı ayını doldurmamış çocuğu olan öğretmenlerin tercihlerinin öncelikle gözetileceği; süt izni kullanan öğretmenlerin programlarının süt iznini kullanmalarına imkân verecek şekilde düzenleneceği belirtildi.</w:t>
+        <w:t>Okul müdürü, haftalık ders programının hazırlanmasında üç ölçütün birlikte gözetileceğini ifade etti: mevzuat hükümleri, derslerin niteliğinden ve öğrencinin günlük dikkat düzeninden doğan pedagojik gerekler ile derslik ve laboratuvar kapasitesi, spor salonu kullanımı gibi okula özgü durumlar. Bu çerçevede beden eğitimi ve müzik derslerinin haftanın ilk ve son iş gününe konulmasına özen gösterileceği; blok ders uygulamalarında dersin özelliğinin dikkate alınacağı; Ortaöğretim Kurumları Yönetmeliği gereğince engelli öğretmenlerin, bakmakla yükümlü olduğu engelli yakını bulunanların ve otuz altı ayını doldurmamış çocuğu olan öğretmenlerin tercihlerinin öncelikle gözetileceği; süt izni kullanan öğretmenlerin programlarının süt iznini kullanmalarına imkân verecek şekilde düzenleneceği belirtildi.</w:t>
       </w:r>
     </w:p>
     <w:p>
@@ -12374,7 +12374,38 @@
           <w:i w:val="0"/>
           <w:sz w:val="20"/>
         </w:rPr>
-        <w:t>Bunların yanında öğretmenlerden toplanan program taleplerinin de imkânlar ölçüsünde değerlendirileceği vurgulandı. Okul müdürlüğünün bu konudaki yaklaşımının, hazırlanan programı olduğu gibi uygulatmak değil; mevzuata ve pedagojik gereklere aykırı düşmeyen, okulun imkânlarıyla bağdaşan talepleri karşılamaya çalışmak olduğu ifade edildi. Ders programı hazırlanırken benimsenen amacın, öğretmen ve öğrenci memnuniyetini artırarak eğitimde kaliteyi yükseltmek olduğu; memnuniyeti yüksek bir öğretmenin derse yansıyan veriminin doğrudan öğrencinin öğrenmesine katkı sağladığı belirtildi. Tercih ve mazeret bildirimlerinin, bu amaçla hazırlanan Ders Programı ve Nöbet Görevi Tercih ve Mazeret Bildirim Formu ile yazılı olarak toplanacağı; formda haftalık ders programına ilişkin mazeret ve tercihler ile nöbet görevine ilişkin muafiyet ve gün tercihlerinin ve ders alınmak istenmeyen saatler çizelgesinin yer aldığı; karşılanamayan taleplerde gerekçenin ilgiliye açıklanacağı kayda geçirildi.</w:t>
+        <w:t xml:space="preserve">Yönetmeliğin 12 nci maddesinin ikinci fıkrasında sayılan pedagojik esaslar çerçevesinde, öğrenci menfaatini esas alan şu hazırlama ilkeleri görüşülerek belirlendi: (a) yoğun dikkat isteyen sayısal derslerle (matematik, fizik, kimya gibi) sözel derslerin her şubenin gününe ve haftasına dengeli dağıtılması; bu derslerin tek güne yığılmaması ve bir şubenin günlük programında yoğun dikkat isteyen derslerin toplamının </w:t>
+      </w:r>
+      <w:r>
+        <w:rPr>
+          <w:b w:val="0"/>
+          <w:i w:val="0"/>
+          <w:color w:val="C00000"/>
+          <w:sz w:val="20"/>
+        </w:rPr>
+        <w:t>[……………………]</w:t>
+      </w:r>
+      <w:r>
+        <w:rPr>
+          <w:b w:val="0"/>
+          <w:i w:val="0"/>
+          <w:sz w:val="20"/>
+        </w:rPr>
+        <w:t xml:space="preserve"> ders saatini aşmaması; (b) bir dersin haftalık ders saatlerinin — blok ders uygulaması dışında — haftanın farklı günlerine yayılması; (c) soyut ve yoğun içerikli derslere günün ilk saatlerinde, uygulamalı ve hareket temelli derslere (beden eğitimi, müzik, görsel sanatlar) son saatlerde öncelik verilmesi; teorik ve uygulamalı derslerin aynı güne düşmesi hâlinde teorik derslerin önce gelmesine özen gösterilmesi; (ç) beden eğitimi gibi hareketli bir dersin hemen ardından gelen saatte aynı şubeye yoğun dikkat isteyen ders yerleştirilmemesine özen gösterilmesi; (d) şubelerin günlük programlarında ders boşluğu bırakılmaması ve şubeler arasında günlük ders yükünün dengeli tutulması. Bu ilkelerle öğretmen tercihlerinin çatışması hâlinde öğrencinin menfaatinin ve pedagojik gereklerin öncelikli olduğu vurgulandı.</w:t>
+      </w:r>
+    </w:p>
+    <w:p>
+      <w:pPr>
+        <w:spacing w:after="80" w:before="0"/>
+        <w:jc w:val="both"/>
+      </w:pPr>
+      <w:r>
+        <w:rPr>
+          <w:b w:val="0"/>
+          <w:i w:val="0"/>
+          <w:sz w:val="20"/>
+        </w:rPr>
+        <w:t>Bunların yanında öğretmenlerden toplanacak program taleplerinin de imkânlar ölçüsünde değerlendirileceği vurgulandı. Okul müdürlüğünün bu konudaki yaklaşımının, hazırlanacak programı olduğu gibi uygulatmak değil; mevzuata ve pedagojik gereklere aykırı düşmeyen, okulun imkânlarıyla bağdaşan talepleri karşılamaya çalışmak olduğu ifade edildi. Ders programı hazırlanırken benimsenen amacın, öğretmen ve öğrenci memnuniyetini artırarak eğitimde kaliteyi yükseltmek olduğu; memnuniyeti yüksek bir öğretmenin derse yansıyan veriminin doğrudan öğrencinin öğrenmesine katkı sağladığı belirtildi. Tercih ve mazeret bildirimlerinin, bu amaçla hazırlanan Ders Programı ve Nöbet Görevi Tercih ve Mazeret Bildirim Formu ile yazılı olarak toplanacağı; formda haftalık ders programına ilişkin mazeret ve tercihler ile nöbet görevine ilişkin muafiyet ve gün tercihlerinin ve ders alınmak istenmeyen saatler çizelgesinin yer aldığı; karşılanamayan taleplerde gerekçenin ilgiliye açıklanacağı kayda geçirildi.</w:t>
       </w:r>
     </w:p>
     <w:p>
@@ -12462,7 +12493,7 @@
           <w:i w:val="0"/>
           <w:sz w:val="20"/>
         </w:rPr>
-        <w:t xml:space="preserve">Haftalık ders programının; mevzuat hükümleri, pedagojik gerekler ve okula özgü durumlar gözetilerek, öğretmenlerden alınan talepler de imkânlar ölçüsünde değerlendirilmek suretiyle hazırlanmasına; görüşülen program ve nöbet planlama esaslarının kabulüne; ders programı ve nöbet görevine ilişkin tercih ve mazeret bildirimlerinin, Ders Programı ve Nöbet Görevi Tercih ve Mazeret Bildirim Formu doldurulup dayanak belgeler eklenerek </w:t>
+        <w:t xml:space="preserve">Haftalık ders programının; mevzuat hükümleri, bu toplantıda kararlaştırılan pedagojik hazırlama ilkeleri ve okula özgü durumlar gözetilerek, öğretmenlerden alınacak talepler de imkânlar ölçüsünde değerlendirilmek suretiyle hazırlanmasına; görüşülen pedagojik hazırlama ilkelerinin ve program-nöbet planlama esaslarının kabulüne; ders programı ve nöbet görevine ilişkin tercih ve mazeret bildirimlerinin, Ders Programı ve Nöbet Görevi Tercih ve Mazeret Bildirim Formu doldurulup dayanak belgeler eklenerek </w:t>
       </w:r>
       <w:r>
         <w:rPr>
@@ -16937,7 +16968,7 @@
           <w:i w:val="0"/>
           <w:sz w:val="20"/>
         </w:rPr>
-        <w:t xml:space="preserve">Haftalık ders programının; mevzuat hükümleri, pedagojik gerekler ve okula özgü durumlar gözetilerek, öğretmenlerden alınan talepler de imkânlar ölçüsünde değerlendirilmek suretiyle hazırlanmasına; görüşülen program ve nöbet planlama esaslarının kabulüne; ders programı ve nöbet görevine ilişkin tercih ve mazeret bildirimlerinin, Ders Programı ve Nöbet Görevi Tercih ve Mazeret Bildirim Formu doldurulup dayanak belgeler eklenerek </w:t>
+        <w:t xml:space="preserve">Haftalık ders programının; mevzuat hükümleri, bu toplantıda kararlaştırılan pedagojik hazırlama ilkeleri ve okula özgü durumlar gözetilerek, öğretmenlerden alınacak talepler de imkânlar ölçüsünde değerlendirilmek suretiyle hazırlanmasına; görüşülen pedagojik hazırlama ilkelerinin ve program-nöbet planlama esaslarının kabulüne; ders programı ve nöbet görevine ilişkin tercih ve mazeret bildirimlerinin, Ders Programı ve Nöbet Görevi Tercih ve Mazeret Bildirim Formu doldurulup dayanak belgeler eklenerek </w:t>
       </w:r>
       <w:r>
         <w:rPr>

</xml_diff>

<commit_message>
Öğretmenler kurulu tutanak seti 2026.08.3 (evrakmotoru İŞ 8 R25+R26)
OKT-001 güncellendi: gündem 18'e sorumluluk sınavları (OKY md.58/2,
birinci dönem penceresi 14-25 Eylül) + KARAR 17 cümlesi; gündem 21'e
2026/70 bent 15 Dijital Esenlik + bent 10 Haberimiz Olsun; gündem 27'ye
bent 14 okul dışı öğrenme ortamları; gündem 4'e tebligat-duyuru usulü ve
MEBBİS İzin İşlemleri/EBYS dijital dönüşümü (PGM 31.07.2026 yazısı) ile
rapor teslim esasları. Üç yeni dayanak künyesi. Aynı ay içi yeniden
yayın: 2026.08.2 ZIP'i kaldırıldı, manifest ve PDF önizlemeler yenilendi.
KVKK ve biçim denetimleri temiz.

Co-Authored-By: Claude Fable 5 <noreply@anthropic.com>
</commit_message>
<xml_diff>
--- a/public/evrak/ogretmenler-kurulu-tutanaklari/GNL-OKR-OKT-001_Sene_Basi_Ogretmenler_Kurulu_Cerceve_Tutanagi_2026-2027_v1.0.docx
+++ b/public/evrak/ogretmenler-kurulu-tutanaklari/GNL-OKR-OKT-001_Sene_Basi_Ogretmenler_Kurulu_Cerceve_Tutanagi_2026-2027_v1.0.docx
@@ -250,7 +250,7 @@
                 <w:i w:val="0"/>
                 <w:sz w:val="18"/>
               </w:rPr>
-              <w:t>• Bu belge, okulapp.org üzerinde yayımlanan GENEL TUTANAK ŞABLONU setinin parçasıdır (sürüm: 2026.08.2 (29.08.2026)). Resmî bir Bakanlık belgesi değildir; okulun şartlarına ve toplantıda gerçekten görüşülen hususlara göre uyarlanır. Metindeki mevzuat atıfları 28.08.2026 tarihi itibarıyla yürürlükteki hükümlere göre yazılmıştır; kullanmadan önce güncelliği kontrol ediniz. Lisans: CC BY 4.0 — kaynak gösterilerek kullanılabilir ve uyarlanabilir.</w:t>
+              <w:t>• Bu belge, okulapp.org üzerinde yayımlanan GENEL TUTANAK ŞABLONU setinin parçasıdır (sürüm: 2026.08.3 (29.08.2026)). Resmî bir Bakanlık belgesi değildir; okulun şartlarına ve toplantıda gerçekten görüşülen hususlara göre uyarlanır. Metindeki mevzuat atıfları 28.08.2026 tarihi itibarıyla yürürlükteki hükümlere göre yazılmıştır; kullanmadan önce güncelliği kontrol ediniz. Lisans: CC BY 4.0 — kaynak gösterilerek kullanılabilir ve uyarlanabilir.</w:t>
             </w:r>
           </w:p>
           <w:p>
@@ -904,7 +904,7 @@
           <w:i w:val="0"/>
           <w:sz w:val="18"/>
         </w:rPr>
-        <w:t>18. Yazılı ve uygulamalı sınavlar: sınav takviminin ilanı, ölçme araçlarına ilişkin sınırlamalar ve okul sınav uygulama yönergesinin hazırlık süreci</w:t>
+        <w:t>18. Yazılı ve uygulamalı sınavlar: sınav takviminin ilanı, birinci dönem sorumluluk sınavları, ölçme araçlarına ilişkin sınırlamalar ve okul sınav uygulama yönergesinin hazırlık süreci</w:t>
       </w:r>
     </w:p>
     <w:p>
@@ -1606,6 +1606,65 @@
           <w:sz w:val="20"/>
         </w:rPr>
         <w:t>Mevzuat çerçevesi bakımından, Ortaöğretim Kurumları Yönetmeliğinde 3 Temmuz 2026 tarihli ve 33299 sayılı Resmî Gazete ile yapılan değişiklikler özetlendi; kurul ve zümrelerin dayanağının anılan Yönetmeliğin 108 inci maddesi ile Eğitim Kurulları ve Zümreleri Yönergesi olduğu, 109 ilâ 114 üncü maddelerin mülga bulunduğu ve bu maddelere atıf yapılmayacağı hatırlatıldı. Her dönem bütün derslerden iki performans puanı verileceği de kayda geçirildi. MEBBİS ve e-Okul'daki dönem başı iş ve işlemlerin müdür yardımcıları koordinesinde yürütüleceği, veri girişlerinin takvime uygun yapılacağı ve kişisel veri güvenliğine azami özen gösterileceği belirtildi.</w:t>
+      </w:r>
+    </w:p>
+    <w:p>
+      <w:pPr>
+        <w:spacing w:after="80" w:before="0"/>
+        <w:jc w:val="both"/>
+      </w:pPr>
+      <w:r>
+        <w:rPr>
+          <w:b w:val="0"/>
+          <w:i w:val="0"/>
+          <w:sz w:val="20"/>
+        </w:rPr>
+        <w:t>Okul müdürü, yazışma ve duyuru düzenine ilişkin okul uygulamasını hatırlattı: duyuru niteliğindeki yazılar okulun duyuru grupları veya personelin MEBBİS'e kayıtlı e-posta adresleri üzerinden paylaşılacak; tebliğ gerektiren diğer hususlar ise ilgilisine imza karşılığı tebliğ edilecektir. Yönetici ve öğretmenlerden, kendilerine gönderilen yazı ve duyuruları düzenli olarak takip etmeleri ve gereğini süresinde yerine getirmeleri istendi.</w:t>
+      </w:r>
+    </w:p>
+    <w:p>
+      <w:pPr>
+        <w:spacing w:after="80" w:before="0"/>
+        <w:jc w:val="both"/>
+      </w:pPr>
+      <w:r>
+        <w:rPr>
+          <w:b w:val="0"/>
+          <w:i w:val="0"/>
+          <w:sz w:val="20"/>
+        </w:rPr>
+        <w:t xml:space="preserve">Personel izin işlemlerinde dijital dönüşüme geçildiği duyuruldu: Personel Genel Müdürlüğünün 31.07.2026 tarihli ve E-16833931-903.05-165376452 sayılı yazısı uyarınca memur ve sözleşmeli personelin yıllık, mazeret, hastalık ve refakat izni işlemleri 10.08.2026 tarihinden itibaren yalnızca MEBBİS e-Personel Modülündeki İzin İşlemleri ekranlarından yürütülmektedir. Talep, personelin kendisi veya okul idaresi tarafından bu ekrandan başlatılmakta; imza süreci EBYS üzerinden tamamlanan izin onay belgesinin tarih ve sayısı, personelin MEBBİS özlük kaydına sistemce yansıtılmaktadır. Amirin takdirine bağlı mazeret izinlerinin (Millî Eğitim Bakanlığı İzin Yönergesinin 10 uncu maddesinin ikinci fıkrası) hizmeti aksatmadan planlanabilmesi için, ani gelişen durumlar dışında taleplerin en az </w:t>
+      </w:r>
+      <w:r>
+        <w:rPr>
+          <w:b w:val="0"/>
+          <w:i w:val="0"/>
+          <w:color w:val="C00000"/>
+          <w:sz w:val="20"/>
+        </w:rPr>
+        <w:t>[……………………]</w:t>
+      </w:r>
+      <w:r>
+        <w:rPr>
+          <w:b w:val="0"/>
+          <w:i w:val="0"/>
+          <w:sz w:val="20"/>
+        </w:rPr>
+        <w:t xml:space="preserve"> iş günü önceden yapılması; ani gelişen ve acele hâllerde doğrudan okul müdürüne başvurulması gerektiği ifade edildi.</w:t>
+      </w:r>
+    </w:p>
+    <w:p>
+      <w:pPr>
+        <w:spacing w:after="80" w:before="0"/>
+        <w:jc w:val="both"/>
+      </w:pPr>
+      <w:r>
+        <w:rPr>
+          <w:b w:val="0"/>
+          <w:i w:val="0"/>
+          <w:sz w:val="20"/>
+        </w:rPr>
+        <w:t>Hastalık raporlarının hastalık iznine çevrilmesinde, Devlet Memurlarına Verilecek Hastalık Raporları ile Hastalık ve Refakat İznine İlişkin Usul ve Esaslar Hakkında Yönetmeliğin 7 nci maddesi ile Millî Eğitim Bakanlığı İzin Yönergesinin 12 nci maddesinin uygulandığı; raporun aslının veya bir örneğinin en geç raporun düzenlendiği günü takip eden günün mesai saati bitimine kadar elektronik ortamda veya uygun yollarla disiplin amiri olan okul müdürüne iletilmesinin, örneği gönderilmişse rapor süresi sonunda aslının teslim edilmesinin zorunlu olduğu; usul ve esaslara uygun alınmayan raporlara dayanılarak hastalık izni verilemeyeceği ve bu yöndeki yazılı bildirim üzerine bildirimi izleyen gün göreve başlanması gerektiği hatırlatıldı.</w:t>
       </w:r>
     </w:p>
     <w:p>
@@ -14224,7 +14283,7 @@
           <w:color w:val="1F3B63"/>
           <w:sz w:val="21"/>
         </w:rPr>
-        <w:t>18. Yazılı ve uygulamalı sınavlar; sınav takvimi ve okul sınav uygulama yönergesi</w:t>
+        <w:t>18. Yazılı ve uygulamalı sınavlar; sınav takvimi, sorumluluk sınavları ve okul sınav uygulama yönergesi</w:t>
       </w:r>
     </w:p>
     <w:p>
@@ -14239,6 +14298,20 @@
           <w:sz w:val="20"/>
         </w:rPr>
         <w:t>Sınav dönemlerinin Ölçme ve Değerlendirme Yönetmeliğinin 5 inci maddesindeki dört pencereye tabi olduğu ve 2026-2027 izdüşümünün birinci dönem birinci sınav için 26 Ekim – 6 Kasım, birinci dönem ikinci sınav için 28 Aralık – 8 Ocak, ikinci dönem birinci sınav için 29 Mart – 9 Nisan, ikinci dönem ikinci sınav için 24 Mayıs – 4 Haziran olduğu paylaşıldı. Bütün yılın sınav takviminin öğretim yılı başında e-Okul üzerinden ilan edileceği, değişikliğin ancak mücbir sebeple ve il/ilçe millî eğitim müdürlüğü onayıyla yapılabileceği belirtildi.</w:t>
+      </w:r>
+    </w:p>
+    <w:p>
+      <w:pPr>
+        <w:spacing w:after="80" w:before="0"/>
+        <w:jc w:val="both"/>
+      </w:pPr>
+      <w:r>
+        <w:rPr>
+          <w:b w:val="0"/>
+          <w:i w:val="0"/>
+          <w:sz w:val="20"/>
+        </w:rPr>
+        <w:t>Ders yılı içindeki yazılı ve uygulamalı sınavlardan ayrı olarak, sorumluluk sınavlarının Ortaöğretim Kurumları Yönetmeliğinin 58 inci maddesinin ikinci fıkrası uyarınca birinci dönemin ilk iki haftası ile ikinci dönemin ilk iki ve son iki haftası içinde yapılacağı; buna göre birinci dönem sorumluluk sınavlarının 14-25 Eylül 2026 tarihleri arasında gerçekleştirileceği belirtildi. Sınav programının okul müdürlüğünce hazırlanıp ilan edileceği; sınavların iki alan öğretmeni, alan öğretmeni bulunmaması hâlinde biri alan öğretmeni olmak üzere iki öğretmen ve bir gözcü öğretmen tarafından yapılacağı, sınava girecek öğrenci sayısının otuzu aşması veya birden fazla salonda sınav yapılması hâlinde her sınav salonu için ayrıca bir gözcü öğretmen görevlendirileceği ve görevlendirmelerin ilgililere yazılı olarak duyurulacağı ifade edildi. Okuldan mezun olamayan 12 nci sınıf öğrencileri ile devamsızlık tebligatı yapıldığı hâlde okula veya sınavlara katılımları sağlanamayan öğrencilerin, sınav tarihinden beş iş günü öncesine kadar okul müdürlüğüne yazılı olarak başvurmaları hâlinde sınav planına dâhil edileceği; Türk dili ve edebiyatı ile yabancı dil derslerinin sorumluluk sınavlarının yazılı ve uygulamalı olarak iki aşamada yapılacağı hatırlatıldı.</w:t>
       </w:r>
     </w:p>
     <w:p>
@@ -14289,7 +14362,7 @@
           <w:i w:val="0"/>
           <w:sz w:val="20"/>
         </w:rPr>
-        <w:t>2026-2027 sınav takvimi, Ölçme ve Değerlendirme Yönetmeliğindeki pencerelere uygun olarak hazırlanıp öğretim yılı başında e-Okul üzerinden ilan edilecektir. Okul sınav uygulama yönergesi taslağı — sınav evrakının ilgili zümrece karşılıklı sayımla teslim edilip teslim alınması ve sınavı olan ders öğretmeninin o gün dersi olmasa da sınav saatinde okulda hazır bulunması hükümleri dâhil — zümre başkanları kurulunun 03.09.2026 tarihli toplantısında öğretmen görüşleri de alınarak görüşülecek; okul müdürünün onayından sonra ilan edilerek yürürlüğe konulacak ve yürürlüğü öğretmenler kuruluna duyurulacaktır.</w:t>
+        <w:t>2026-2027 sınav takvimi, Ölçme ve Değerlendirme Yönetmeliğindeki pencerelere uygun olarak hazırlanıp öğretim yılı başında e-Okul üzerinden ilan edilecektir. Okul sınav uygulama yönergesi taslağı — sınav evrakının ilgili zümrece karşılıklı sayımla teslim edilip teslim alınması ve sınavı olan ders öğretmeninin o gün dersi olmasa da sınav saatinde okulda hazır bulunması hükümleri dâhil — zümre başkanları kurulunun 03.09.2026 tarihli toplantısında öğretmen görüşleri de alınarak görüşülecek; okul müdürünün onayından sonra ilan edilerek yürürlüğe konulacak ve yürürlüğü öğretmenler kuruluna duyurulacaktır. Birinci dönem sorumluluk sınavları 14-25 Eylül 2026 tarihleri arasında yapılacak; sınav programı ile komisyon ve gözcü görevlendirmeleri okul müdürlüğünce hazırlanarak ilan edilecek ve ilgililere yazılı olarak duyurulacaktır.</w:t>
       </w:r>
     </w:p>
     <w:p>
@@ -14445,6 +14518,20 @@
           <w:sz w:val="20"/>
         </w:rPr>
         <w:t>Yılın temasının 'Maarifin Kalbinde Oyun' olduğu; yaş ve gelişim özelliklerine uygun, güvenli ve kapsayıcı oyun etkinliklerine ve geleneksel çocuk oyunlarına eğitim süreçlerinde yer verileceği belirtildi. Tasarımı yenilenen EBA platformunun bu yıl hizmete gireceği; bireysel öğrenme platformu, materyal siteleri ve yapay zekâ destekli uygulamalar ile diğer dijital platformların öğrenci, öğretmen ve velilere tanıtılacağı ve ders içi ile ders dışı faaliyetlerde amaca uygun kullanılacağı; program dışı etkinlikler ve okul temelli planlama doğrultusunda ortaöğretim kademesinde Bakanlıkça belirtilen materyalden yararlanılacağı ifade edildi. Beceri odaklı ölçme, sıralama amaçlı okul geneli sınav yasağı, Türk dili ve edebiyatı dersinde dört eser ile bir film analizi ve program görüşü girişlerine ilişkin hükümlerin yürürlükte olduğu hatırlatıldı.</w:t>
+      </w:r>
+    </w:p>
+    <w:p>
+      <w:pPr>
+        <w:spacing w:after="80" w:before="0"/>
+        <w:jc w:val="both"/>
+      </w:pPr>
+      <w:r>
+        <w:rPr>
+          <w:b w:val="0"/>
+          <w:i w:val="0"/>
+          <w:sz w:val="20"/>
+        </w:rPr>
+        <w:t>Genelge uyarınca, öğrencilerin dijital dünyada güvenli, bilinçli, sorumlu ve değer temelli bir yaklaşımla hareket eden bireyler olarak yetişmelerini desteklemek amacıyla Duygu-Değer Temelli Dijital Esenlik Projesi kapsamında hazırlanan eğitim içeriklerinden yararlanılacağı; çevrim içi haklar, dijital mahremiyet, siber güvenlik, dijital etik, duygu farkındalığı ve dijital esenlik konularının rehberlik çalışmaları ve ilgili derslerle ilişkilendirileceği belirtildi. Öğrencilerin aktif katılımıyla hazırlanan Haberimiz Olsun dijital platformunda yayımlanan video, sesli ve yazılı medya içeriklerinden eğitim ortamlarında yararlanılacağı; bu içeriklerin ilgili derslerin konu ve öğrenme çıktılarıyla ilişkilendirilerek eğitim süreçlerine dâhil edileceği ve okulda dezenformasyonla mücadeleyi destekleyen, doğru bilgiye dayalı bir medya kültürünün geliştirileceği ifade edildi.</w:t>
       </w:r>
     </w:p>
     <w:p>
@@ -15566,6 +15653,20 @@
           <w:i w:val="0"/>
           <w:sz w:val="20"/>
         </w:rPr>
+        <w:t>Öğrencilerin öğrenmelerini gerçek yaşamla ilişkilendirmelerini, yaparak ve yaşayarak öğrenmelerini ve öncelikle içinde yaşadıkları toplumu ve coğrafyayı yakından tanımalarını desteklemek amacıyla, genelge uyarınca okul dışı öğrenme ortamlarının eğitim ve öğretim süreçlerine etkin biçimde dâhil edileceği; planlamada Okul Dışı Öğrenme Ortamları Dijital Platformu'nda (okuldisiogrenme.eba.gov.tr) yer alan içeriklerden yararlanılacağı ve bu kapsamdaki gezilerin de veli izni ile e-Okul sosyal etkinlik modülü kayıtlarına ilişkin esaslara tabi olduğu belirtildi.</w:t>
+      </w:r>
+    </w:p>
+    <w:p>
+      <w:pPr>
+        <w:spacing w:after="80" w:before="0"/>
+        <w:jc w:val="both"/>
+      </w:pPr>
+      <w:r>
+        <w:rPr>
+          <w:b w:val="0"/>
+          <w:i w:val="0"/>
+          <w:sz w:val="20"/>
+        </w:rPr>
         <w:t>Sosyal etkinliklerde millî ve manevi, ahlaki, kültürel ve insani değerlerin gözetileceği; öğrencilerin psikososyal gelişimini ve akran desteğini güçlendiren etkinliklere ağırlık verileceği; tören, kutlama, anma günü ve mezuniyet etkinliklerinde kullanılacak materyallerin eser inceleme ve seçme kurulu onayından geçeceği; törenlerin bütün sınıf düzeylerini kapsayacak biçimde planlanacağı; uluslararası kardeş okul uygulamasına katılımın teşvik edileceği ifade edildi. Değerler eğitimi ve sosyal sorumluluk programı çalışmalarının yıl planına bağlanacağı kararlaştırıldı.</w:t>
       </w:r>
     </w:p>
@@ -17293,7 +17394,7 @@
           <w:i w:val="0"/>
           <w:sz w:val="20"/>
         </w:rPr>
-        <w:t>2026-2027 sınav takvimi, Ölçme ve Değerlendirme Yönetmeliğindeki pencerelere uygun olarak hazırlanıp öğretim yılı başında e-Okul üzerinden ilan edilecektir. Okul sınav uygulama yönergesi taslağı — sınav evrakının ilgili zümrece karşılıklı sayımla teslim edilip teslim alınması ve sınavı olan ders öğretmeninin o gün dersi olmasa da sınav saatinde okulda hazır bulunması hükümleri dâhil — zümre başkanları kurulunun 03.09.2026 tarihli toplantısında öğretmen görüşleri de alınarak görüşülecek; okul müdürünün onayından sonra ilan edilerek yürürlüğe konulacak ve yürürlüğü öğretmenler kuruluna duyurulacaktır.</w:t>
+        <w:t>2026-2027 sınav takvimi, Ölçme ve Değerlendirme Yönetmeliğindeki pencerelere uygun olarak hazırlanıp öğretim yılı başında e-Okul üzerinden ilan edilecektir. Okul sınav uygulama yönergesi taslağı — sınav evrakının ilgili zümrece karşılıklı sayımla teslim edilip teslim alınması ve sınavı olan ders öğretmeninin o gün dersi olmasa da sınav saatinde okulda hazır bulunması hükümleri dâhil — zümre başkanları kurulunun 03.09.2026 tarihli toplantısında öğretmen görüşleri de alınarak görüşülecek; okul müdürünün onayından sonra ilan edilerek yürürlüğe konulacak ve yürürlüğü öğretmenler kuruluna duyurulacaktır. Birinci dönem sorumluluk sınavları 14-25 Eylül 2026 tarihleri arasında yapılacak; sınav programı ile komisyon ve gözcü görevlendirmeleri okul müdürlüğünce hazırlanarak ilan edilecek ve ilgililere yazılı olarak duyurulacaktır.</w:t>
       </w:r>
     </w:p>
     <w:p>
@@ -18679,6 +18780,108 @@
                 <w:sz w:val="18"/>
               </w:rPr>
               <w:t>28, 32</w:t>
+            </w:r>
+          </w:p>
+        </w:tc>
+      </w:tr>
+      <w:tr>
+        <w:tc>
+          <w:tcPr>
+            <w:tcW w:w="6350" w:type="dxa"/>
+          </w:tcPr>
+          <w:p>
+            <w:r/>
+            <w:r>
+              <w:rPr>
+                <w:b w:val="0"/>
+                <w:i w:val="0"/>
+                <w:sz w:val="18"/>
+              </w:rPr>
+              <w:t>Millî Eğitim Bakanlığı İzin Yönergesi (16.01.2013 tarihli ve 34932 sayılı Bakan Onayı; son değişiklik 10.04.2015)</w:t>
+            </w:r>
+          </w:p>
+        </w:tc>
+        <w:tc>
+          <w:tcPr>
+            <w:tcW w:w="3742" w:type="dxa"/>
+          </w:tcPr>
+          <w:p>
+            <w:r/>
+            <w:r>
+              <w:rPr>
+                <w:b w:val="0"/>
+                <w:i w:val="0"/>
+                <w:sz w:val="18"/>
+              </w:rPr>
+              <w:t>4</w:t>
+            </w:r>
+          </w:p>
+        </w:tc>
+      </w:tr>
+      <w:tr>
+        <w:tc>
+          <w:tcPr>
+            <w:tcW w:w="6350" w:type="dxa"/>
+          </w:tcPr>
+          <w:p>
+            <w:r/>
+            <w:r>
+              <w:rPr>
+                <w:b w:val="0"/>
+                <w:i w:val="0"/>
+                <w:sz w:val="18"/>
+              </w:rPr>
+              <w:t>Devlet Memurlarına Verilecek Hastalık Raporları ile Hastalık ve Refakat İznine İlişkin Usul ve Esaslar Hakkında Yönetmelik (BKK 2011/2226; RG 29.10.2011/28099)</w:t>
+            </w:r>
+          </w:p>
+        </w:tc>
+        <w:tc>
+          <w:tcPr>
+            <w:tcW w:w="3742" w:type="dxa"/>
+          </w:tcPr>
+          <w:p>
+            <w:r/>
+            <w:r>
+              <w:rPr>
+                <w:b w:val="0"/>
+                <w:i w:val="0"/>
+                <w:sz w:val="18"/>
+              </w:rPr>
+              <w:t>4</w:t>
+            </w:r>
+          </w:p>
+        </w:tc>
+      </w:tr>
+      <w:tr>
+        <w:tc>
+          <w:tcPr>
+            <w:tcW w:w="6350" w:type="dxa"/>
+          </w:tcPr>
+          <w:p>
+            <w:r/>
+            <w:r>
+              <w:rPr>
+                <w:b w:val="0"/>
+                <w:i w:val="0"/>
+                <w:sz w:val="18"/>
+              </w:rPr>
+              <w:t>Millî Eğitim Bakanlığı Personel Genel Müdürlüğünün izin işlemlerinin MEBBİS İzin İşlemleri ekranlarından yürütülmesine ilişkin 31.07.2026 tarihli ve E-16833931-903.05-165376452 sayılı yazısı</w:t>
+            </w:r>
+          </w:p>
+        </w:tc>
+        <w:tc>
+          <w:tcPr>
+            <w:tcW w:w="3742" w:type="dxa"/>
+          </w:tcPr>
+          <w:p>
+            <w:r/>
+            <w:r>
+              <w:rPr>
+                <w:b w:val="0"/>
+                <w:i w:val="0"/>
+                <w:sz w:val="18"/>
+              </w:rPr>
+              <w:t>4</w:t>
             </w:r>
           </w:p>
         </w:tc>

</xml_diff>

<commit_message>
Belge arşivi: öğretmenler kurulu tutanak seti 2026.08.4 — İSG kurulu eşiği düzeltildi
GNL-OKR-OKT-001 gündem 29'un ilk cümlesi "101-110 çalışanı bulunan okulda iş
sağlığı ve güvenliği kurulunun zorunlu olduğu" biçimindeydi; bant üretici okulun
kendi çalışan aralığı olduğu hâlde cümle eşik gibi okunuyordu. Doğru eşik elli
çalışandır (6331 sayılı Kanun md. 22/1; İSG Kurulları Hakkında Yönetmelik
md. 4/1). Genel sürümde cümle eşikle yeniden yazıldı, okulun çalışan sayısı yer
tutucuya alındı ve elli çalışanın altındaki okullarda kurul yerine İSG ekibi
kurulduğu (OKY md. 120) eklendi.

Diğer iki tutanağın metni değişmedi; yalnız sürüm künyesi 2026.08.4 oldu.

Co-Authored-By: Claude Opus 5 <noreply@anthropic.com>
</commit_message>
<xml_diff>
--- a/public/evrak/ogretmenler-kurulu-tutanaklari/GNL-OKR-OKT-001_Sene_Basi_Ogretmenler_Kurulu_Cerceve_Tutanagi_2026-2027_v1.0.docx
+++ b/public/evrak/ogretmenler-kurulu-tutanaklari/GNL-OKR-OKT-001_Sene_Basi_Ogretmenler_Kurulu_Cerceve_Tutanagi_2026-2027_v1.0.docx
@@ -250,7 +250,7 @@
                 <w:i w:val="0"/>
                 <w:sz w:val="18"/>
               </w:rPr>
-              <w:t>• Bu belge, okulapp.org üzerinde yayımlanan GENEL TUTANAK ŞABLONU setinin parçasıdır (sürüm: 2026.08.3 (29.08.2026)). Resmî bir Bakanlık belgesi değildir; okulun şartlarına ve toplantıda gerçekten görüşülen hususlara göre uyarlanır. Metindeki mevzuat atıfları 28.08.2026 tarihi itibarıyla yürürlükteki hükümlere göre yazılmıştır; kullanmadan önce güncelliği kontrol ediniz. Lisans: CC BY 4.0 — kaynak gösterilerek kullanılabilir ve uyarlanabilir.</w:t>
+              <w:t>• Bu belge, okulapp.org üzerinde yayımlanan GENEL TUTANAK ŞABLONU setinin parçasıdır (sürüm: 2026.08.4 (29.08.2026)). Resmî bir Bakanlık belgesi değildir; okulun şartlarına ve toplantıda gerçekten görüşülen hususlara göre uyarlanır. Metindeki mevzuat atıfları 28.08.2026 tarihi itibarıyla yürürlükteki hükümlere göre yazılmıştır; kullanmadan önce güncelliği kontrol ediniz. Lisans: CC BY 4.0 — kaynak gösterilerek kullanılabilir ve uyarlanabilir.</w:t>
             </w:r>
           </w:p>
           <w:p>
@@ -15884,7 +15884,24 @@
           <w:i w:val="0"/>
           <w:sz w:val="20"/>
         </w:rPr>
-        <w:t>101-110 çalışanı bulunan okulda iş sağlığı ve güvenliği kurulunun zorunlu olduğu, kurulun toplantı periyodu kararını kendi ilk toplantısında alacağı; acil durum ekipleri ile risk değerlendirmesinin güncelleneceği belirtildi. Gıda işletmeleri denetim komisyonunun her ay denetim yapacağı; komisyonun müdür veya müdür yardımcısı başkanlığında, iş sağlığı ve güvenliği kurulundan iki üye ile okul-aile birliği yönetiminden bir veliden oluştuğu hatırlatıldı. Kantin, kafeterya ve büfe gibi gıda işletmelerinin ilgili genelge ve kılavuzlara uygun yönetileceği; sosyal etkinlik ve kermeslerde de gıda güvenilirliği ile hijyen kurallarına uygun ürünler sunulacağı ifade edildi.</w:t>
+        <w:t xml:space="preserve">Elli ve daha fazla çalışanı bulunan ve altı aydan fazla süren sürekli işlerin yapıldığı işyerlerinde iş sağlığı ve güvenliği kurulu oluşturulmasının zorunlu olduğu, okulumuzun </w:t>
+      </w:r>
+      <w:r>
+        <w:rPr>
+          <w:b w:val="0"/>
+          <w:i w:val="0"/>
+          <w:color w:val="C00000"/>
+          <w:sz w:val="20"/>
+        </w:rPr>
+        <w:t>[…………………………………………]</w:t>
+      </w:r>
+      <w:r>
+        <w:rPr>
+          <w:b w:val="0"/>
+          <w:i w:val="0"/>
+          <w:sz w:val="20"/>
+        </w:rPr>
+        <w:t xml:space="preserve"> çalışanıyla bu kapsamda bulunduğu; elli çalışanın altındaki okullarda kurul yerine iş sağlığı ve güvenliği ekibi oluşturulduğu; kurulun toplantı periyodu kararını kendi ilk toplantısında alacağı; acil durum ekipleri ile risk değerlendirmesinin güncelleneceği belirtildi. Gıda işletmeleri denetim komisyonunun her ay denetim yapacağı; komisyonun müdür veya müdür yardımcısı başkanlığında, iş sağlığı ve güvenliği kurulundan iki üye ile okul-aile birliği yönetiminden bir veliden oluştuğu hatırlatıldı. Kantin, kafeterya ve büfe gibi gıda işletmelerinin ilgili genelge ve kılavuzlara uygun yönetileceği; sosyal etkinlik ve kermeslerde de gıda güvenilirliği ile hijyen kurallarına uygun ürünler sunulacağı ifade edildi.</w:t>
       </w:r>
     </w:p>
     <w:p>

</xml_diff>